<commit_message>
docs: archive CodeArts analysis models
</commit_message>
<xml_diff>
--- a/docs/analysis/需求分析报告V1.0.docx
+++ b/docs/analysis/需求分析报告V1.0.docx
@@ -3365,7 +3365,7 @@
       <w:r>
         <w:drawing>
           <wp:inline xmlns:a="http://schemas.openxmlformats.org/drawingml/2006/main" xmlns:pic="http://schemas.openxmlformats.org/drawingml/2006/picture">
-            <wp:extent cx="5903999" cy="3675485"/>
+            <wp:extent cx="5903999" cy="4349771"/>
             <wp:docPr id="1" name="Picture 1"/>
             <wp:cNvGraphicFramePr>
               <a:graphicFrameLocks noChangeAspect="1"/>
@@ -3386,7 +3386,7 @@
                   <pic:spPr>
                     <a:xfrm>
                       <a:off x="0" y="0"/>
-                      <a:ext cx="5903999" cy="3675485"/>
+                      <a:ext cx="5903999" cy="4349771"/>
                     </a:xfrm>
                     <a:prstGeom prst="rect"/>
                   </pic:spPr>
@@ -4417,7 +4417,7 @@
       <w:r>
         <w:drawing>
           <wp:inline xmlns:a="http://schemas.openxmlformats.org/drawingml/2006/main" xmlns:pic="http://schemas.openxmlformats.org/drawingml/2006/picture">
-            <wp:extent cx="4737333" cy="4752000"/>
+            <wp:extent cx="4823495" cy="4752000"/>
             <wp:docPr id="4" name="Picture 4"/>
             <wp:cNvGraphicFramePr>
               <a:graphicFrameLocks noChangeAspect="1"/>
@@ -4438,7 +4438,7 @@
                   <pic:spPr>
                     <a:xfrm>
                       <a:off x="0" y="0"/>
-                      <a:ext cx="4737333" cy="4752000"/>
+                      <a:ext cx="4823495" cy="4752000"/>
                     </a:xfrm>
                     <a:prstGeom prst="rect"/>
                   </pic:spPr>
@@ -5956,7 +5956,7 @@
         <w:ind w:firstLine="420"/>
       </w:pPr>
       <w:r>
-        <w:t>文本与 PlantUML 图源已完成静态核对，核心类图与三张时序图均通过 PlantUML 语法渲染。数据采集入库图已有 CodeArts 导入候选包；核心类图、认领审核和检索处理仍须在 CodeArts Modeling 中导入或重绘、人工精修并重新导出。最终提交前还需由各模型负责人逐图签认，补齐两小组全体成员的实际 AI 使用记录与签名；课堂展示后将教师及互评意见写入修改说明与版本记录表。</w:t>
+        <w:t>文本与 PlantUML 图源已完成静态核对，核心类图与三张时序图均通过 PlantUML 语法渲染。核心类图、数据采集入库图和检索请求处理图的 CodeArts XMI 已归档，其中核心类图与检索图已有同版本正式 PNG；采集图仍须补导正式 PNG。门户认领审核图目前只有 PlantUML 底稿，仍须在 CodeArts Modeling 中重绘或导入、精修并导出 XMI 与清晰图片。最终提交前还需由各模型负责人逐图签认，补齐两小组全体成员的实际 AI 使用记录与签名；课堂展示后将教师及互评意见写入修改说明与版本记录表。</w:t>
       </w:r>
     </w:p>
     <w:p>
@@ -6348,7 +6348,7 @@
                 <w:color w:val="1C232A"/>
                 <w:sz w:val="17"/>
               </w:rPr>
-              <w:t>底稿完成，待 CodeArts 精修</w:t>
+              <w:t>CodeArts XMI 与正式 PNG 已归档，待签认</w:t>
             </w:r>
           </w:p>
         </w:tc>
@@ -6469,7 +6469,7 @@
                 <w:color w:val="1C232A"/>
                 <w:sz w:val="17"/>
               </w:rPr>
-              <w:t>底稿及候选包完成，待平台验证</w:t>
+              <w:t>CodeArts XMI 已归档，待补正式 PNG 与签认</w:t>
             </w:r>
           </w:p>
         </w:tc>
@@ -6715,7 +6715,7 @@
                 <w:color w:val="1C232A"/>
                 <w:sz w:val="17"/>
               </w:rPr>
-              <w:t>底稿完成，待 CodeArts 精修</w:t>
+              <w:t>CodeArts XMI 与正式 PNG 已归档，待签认</w:t>
             </w:r>
           </w:p>
         </w:tc>

</xml_diff>